<commit_message>
report: rebuild Word report with proposed role allocation
Co-Authored-By: Claude Opus 5.5 <noreply@anthropic.com>
</commit_message>
<xml_diff>
--- a/report/Kimuntu_AI_Week1_Report.docx
+++ b/report/Kimuntu_AI_Week1_Report.docx
@@ -10270,488 +10270,37 @@
         <w:t>Group members</w:t>
       </w:r>
     </w:p>
-    <w:tbl>
-      <w:tblPr>
-        <w:tblStyle w:val="TableGrid"/>
-        <w:tblW w:type="auto" w:w="0"/>
-        <w:jc w:val="center"/>
-        <w:tblLayout w:type="fixed"/>
-        <w:tblLook w:firstColumn="1" w:firstRow="1" w:lastColumn="0" w:lastRow="0" w:noHBand="0" w:noVBand="1" w:val="04A0"/>
-      </w:tblPr>
-      <w:tblGrid>
-        <w:gridCol w:w="4873"/>
-        <w:gridCol w:w="4873"/>
-      </w:tblGrid>
-      <w:tr>
-        <w:tc>
-          <w:tcPr>
-            <w:tcW w:type="dxa" w:w="4198"/>
-            <w:shd w:val="clear" w:color="auto" w:fill="D9E2F3"/>
-          </w:tcPr>
-          <w:p>
-            <w:r>
-              <w:rPr>
-                <w:sz w:val="18"/>
-              </w:rPr>
-            </w:r>
-            <w:r>
-              <w:rPr>
-                <w:b/>
-                <w:sz w:val="18"/>
-              </w:rPr>
-              <w:t>Name</w:t>
-            </w:r>
-          </w:p>
-        </w:tc>
-        <w:tc>
-          <w:tcPr>
-            <w:tcW w:type="dxa" w:w="5213"/>
-            <w:shd w:val="clear" w:color="auto" w:fill="D9E2F3"/>
-          </w:tcPr>
-          <w:p>
-            <w:r>
-              <w:rPr>
-                <w:sz w:val="18"/>
-              </w:rPr>
-            </w:r>
-            <w:r>
-              <w:rPr>
-                <w:b/>
-                <w:sz w:val="18"/>
-              </w:rPr>
-              <w:t>Assigned role</w:t>
-            </w:r>
-          </w:p>
-        </w:tc>
-      </w:tr>
-      <w:tr>
-        <w:tc>
-          <w:tcPr>
-            <w:tcW w:type="dxa" w:w="4198"/>
-          </w:tcPr>
-          <w:p>
-            <w:r>
-              <w:rPr>
-                <w:b w:val="0"/>
-                <w:sz w:val="18"/>
-              </w:rPr>
-              <w:t>KAZIBWE BENJAMIN</w:t>
-            </w:r>
-          </w:p>
-        </w:tc>
-        <w:tc>
-          <w:tcPr>
-            <w:tcW w:type="dxa" w:w="5213"/>
-          </w:tcPr>
-          <w:p>
-            <w:r>
-              <w:rPr>
-                <w:b w:val="0"/>
-                <w:sz w:val="18"/>
-                <w:highlight w:val="yellow"/>
-              </w:rPr>
-              <w:t>[PLACEHOLDER]</w:t>
-            </w:r>
-          </w:p>
-        </w:tc>
-      </w:tr>
-      <w:tr>
-        <w:tc>
-          <w:tcPr>
-            <w:tcW w:type="dxa" w:w="4198"/>
-          </w:tcPr>
-          <w:p>
-            <w:r>
-              <w:rPr>
-                <w:b w:val="0"/>
-                <w:sz w:val="18"/>
-              </w:rPr>
-              <w:t>NAMUSANA REBECCA</w:t>
-            </w:r>
-          </w:p>
-        </w:tc>
-        <w:tc>
-          <w:tcPr>
-            <w:tcW w:type="dxa" w:w="5213"/>
-          </w:tcPr>
-          <w:p>
-            <w:r>
-              <w:rPr>
-                <w:b w:val="0"/>
-                <w:sz w:val="18"/>
-                <w:highlight w:val="yellow"/>
-              </w:rPr>
-              <w:t>[PLACEHOLDER]</w:t>
-            </w:r>
-          </w:p>
-        </w:tc>
-      </w:tr>
-      <w:tr>
-        <w:tc>
-          <w:tcPr>
-            <w:tcW w:type="dxa" w:w="4198"/>
-          </w:tcPr>
-          <w:p>
-            <w:r>
-              <w:rPr>
-                <w:b w:val="0"/>
-                <w:sz w:val="18"/>
-              </w:rPr>
-              <w:t>CHOL MANGONG AJAL BOL</w:t>
-            </w:r>
-          </w:p>
-        </w:tc>
-        <w:tc>
-          <w:tcPr>
-            <w:tcW w:type="dxa" w:w="5213"/>
-          </w:tcPr>
-          <w:p>
-            <w:r>
-              <w:rPr>
-                <w:b w:val="0"/>
-                <w:sz w:val="18"/>
-                <w:highlight w:val="yellow"/>
-              </w:rPr>
-              <w:t>[PLACEHOLDER]</w:t>
-            </w:r>
-          </w:p>
-        </w:tc>
-      </w:tr>
-      <w:tr>
-        <w:tc>
-          <w:tcPr>
-            <w:tcW w:type="dxa" w:w="4198"/>
-          </w:tcPr>
-          <w:p>
-            <w:r>
-              <w:rPr>
-                <w:b w:val="0"/>
-                <w:sz w:val="18"/>
-              </w:rPr>
-              <w:t>KAWUMA MICHAEL</w:t>
-            </w:r>
-          </w:p>
-        </w:tc>
-        <w:tc>
-          <w:tcPr>
-            <w:tcW w:type="dxa" w:w="5213"/>
-          </w:tcPr>
-          <w:p>
-            <w:r>
-              <w:rPr>
-                <w:b w:val="0"/>
-                <w:sz w:val="18"/>
-                <w:highlight w:val="yellow"/>
-              </w:rPr>
-              <w:t>[PLACEHOLDER]</w:t>
-            </w:r>
-          </w:p>
-        </w:tc>
-      </w:tr>
-      <w:tr>
-        <w:tc>
-          <w:tcPr>
-            <w:tcW w:type="dxa" w:w="4198"/>
-          </w:tcPr>
-          <w:p>
-            <w:r>
-              <w:rPr>
-                <w:b w:val="0"/>
-                <w:sz w:val="18"/>
-              </w:rPr>
-              <w:t>Mustapha suleiman Ali</w:t>
-            </w:r>
-          </w:p>
-        </w:tc>
-        <w:tc>
-          <w:tcPr>
-            <w:tcW w:type="dxa" w:w="5213"/>
-          </w:tcPr>
-          <w:p>
-            <w:r>
-              <w:rPr>
-                <w:b w:val="0"/>
-                <w:sz w:val="18"/>
-                <w:highlight w:val="yellow"/>
-              </w:rPr>
-              <w:t>[PLACEHOLDER]</w:t>
-            </w:r>
-          </w:p>
-        </w:tc>
-      </w:tr>
-      <w:tr>
-        <w:tc>
-          <w:tcPr>
-            <w:tcW w:type="dxa" w:w="4198"/>
-          </w:tcPr>
-          <w:p>
-            <w:r>
-              <w:rPr>
-                <w:b w:val="0"/>
-                <w:sz w:val="18"/>
-              </w:rPr>
-              <w:t>NAZIF SABO DANLADI</w:t>
-            </w:r>
-          </w:p>
-        </w:tc>
-        <w:tc>
-          <w:tcPr>
-            <w:tcW w:type="dxa" w:w="5213"/>
-          </w:tcPr>
-          <w:p>
-            <w:r>
-              <w:rPr>
-                <w:b w:val="0"/>
-                <w:sz w:val="18"/>
-                <w:highlight w:val="yellow"/>
-              </w:rPr>
-              <w:t>[PLACEHOLDER]</w:t>
-            </w:r>
-          </w:p>
-        </w:tc>
-      </w:tr>
-      <w:tr>
-        <w:tc>
-          <w:tcPr>
-            <w:tcW w:type="dxa" w:w="4198"/>
-          </w:tcPr>
-          <w:p>
-            <w:r>
-              <w:rPr>
-                <w:b w:val="0"/>
-                <w:sz w:val="18"/>
-              </w:rPr>
-              <w:t>Henok Tesfahiwet Lbab Fidel</w:t>
-            </w:r>
-          </w:p>
-        </w:tc>
-        <w:tc>
-          <w:tcPr>
-            <w:tcW w:type="dxa" w:w="5213"/>
-          </w:tcPr>
-          <w:p>
-            <w:r>
-              <w:rPr>
-                <w:b w:val="0"/>
-                <w:sz w:val="18"/>
-                <w:highlight w:val="yellow"/>
-              </w:rPr>
-              <w:t>[PLACEHOLDER]</w:t>
-            </w:r>
-          </w:p>
-        </w:tc>
-      </w:tr>
-      <w:tr>
-        <w:tc>
-          <w:tcPr>
-            <w:tcW w:type="dxa" w:w="4198"/>
-          </w:tcPr>
-          <w:p>
-            <w:r>
-              <w:rPr>
-                <w:b w:val="0"/>
-                <w:sz w:val="18"/>
-              </w:rPr>
-              <w:t>BIYINZIKA EMMANUEL ONYUTA</w:t>
-            </w:r>
-          </w:p>
-        </w:tc>
-        <w:tc>
-          <w:tcPr>
-            <w:tcW w:type="dxa" w:w="5213"/>
-          </w:tcPr>
-          <w:p>
-            <w:r>
-              <w:rPr>
-                <w:b w:val="0"/>
-                <w:sz w:val="18"/>
-                <w:highlight w:val="yellow"/>
-              </w:rPr>
-              <w:t>[PLACEHOLDER]</w:t>
-            </w:r>
-          </w:p>
-        </w:tc>
-      </w:tr>
-      <w:tr>
-        <w:tc>
-          <w:tcPr>
-            <w:tcW w:type="dxa" w:w="4198"/>
-          </w:tcPr>
-          <w:p>
-            <w:r>
-              <w:rPr>
-                <w:b w:val="0"/>
-                <w:sz w:val="18"/>
-              </w:rPr>
-              <w:t>TWIJUKYE DISMAS</w:t>
-            </w:r>
-          </w:p>
-        </w:tc>
-        <w:tc>
-          <w:tcPr>
-            <w:tcW w:type="dxa" w:w="5213"/>
-          </w:tcPr>
-          <w:p>
-            <w:r>
-              <w:rPr>
-                <w:b w:val="0"/>
-                <w:sz w:val="18"/>
-                <w:highlight w:val="yellow"/>
-              </w:rPr>
-              <w:t>[PLACEHOLDER]</w:t>
-            </w:r>
-          </w:p>
-        </w:tc>
-      </w:tr>
-      <w:tr>
-        <w:tc>
-          <w:tcPr>
-            <w:tcW w:type="dxa" w:w="4198"/>
-          </w:tcPr>
-          <w:p>
-            <w:r>
-              <w:rPr>
-                <w:b w:val="0"/>
-                <w:sz w:val="18"/>
-              </w:rPr>
-              <w:t>NASSEJJE RACHEAL</w:t>
-            </w:r>
-          </w:p>
-        </w:tc>
-        <w:tc>
-          <w:tcPr>
-            <w:tcW w:type="dxa" w:w="5213"/>
-          </w:tcPr>
-          <w:p>
-            <w:r>
-              <w:rPr>
-                <w:b w:val="0"/>
-                <w:sz w:val="18"/>
-                <w:highlight w:val="yellow"/>
-              </w:rPr>
-              <w:t>[PLACEHOLDER]</w:t>
-            </w:r>
-          </w:p>
-        </w:tc>
-      </w:tr>
-      <w:tr>
-        <w:tc>
-          <w:tcPr>
-            <w:tcW w:type="dxa" w:w="4198"/>
-          </w:tcPr>
-          <w:p>
-            <w:r>
-              <w:rPr>
-                <w:b w:val="0"/>
-                <w:sz w:val="18"/>
-              </w:rPr>
-              <w:t>ATUHAIRE LYNNET</w:t>
-            </w:r>
-          </w:p>
-        </w:tc>
-        <w:tc>
-          <w:tcPr>
-            <w:tcW w:type="dxa" w:w="5213"/>
-          </w:tcPr>
-          <w:p>
-            <w:r>
-              <w:rPr>
-                <w:b w:val="0"/>
-                <w:sz w:val="18"/>
-                <w:highlight w:val="yellow"/>
-              </w:rPr>
-              <w:t>[PLACEHOLDER]</w:t>
-            </w:r>
-          </w:p>
-        </w:tc>
-      </w:tr>
-      <w:tr>
-        <w:tc>
-          <w:tcPr>
-            <w:tcW w:type="dxa" w:w="4198"/>
-          </w:tcPr>
-          <w:p>
-            <w:r>
-              <w:rPr>
-                <w:b w:val="0"/>
-                <w:sz w:val="18"/>
-              </w:rPr>
-              <w:t>TUGUME ANDREW</w:t>
-            </w:r>
-          </w:p>
-        </w:tc>
-        <w:tc>
-          <w:tcPr>
-            <w:tcW w:type="dxa" w:w="5213"/>
-          </w:tcPr>
-          <w:p>
-            <w:r>
-              <w:rPr>
-                <w:b w:val="0"/>
-                <w:sz w:val="18"/>
-                <w:highlight w:val="yellow"/>
-              </w:rPr>
-              <w:t>[PLACEHOLDER]</w:t>
-            </w:r>
-          </w:p>
-        </w:tc>
-      </w:tr>
-      <w:tr>
-        <w:tc>
-          <w:tcPr>
-            <w:tcW w:type="dxa" w:w="4198"/>
-          </w:tcPr>
-          <w:p>
-            <w:r>
-              <w:rPr>
-                <w:b w:val="0"/>
-                <w:sz w:val="18"/>
-              </w:rPr>
-              <w:t>Baboucarr A Bobb</w:t>
-            </w:r>
-          </w:p>
-        </w:tc>
-        <w:tc>
-          <w:tcPr>
-            <w:tcW w:type="dxa" w:w="5213"/>
-          </w:tcPr>
-          <w:p>
-            <w:r>
-              <w:rPr>
-                <w:b w:val="0"/>
-                <w:sz w:val="18"/>
-                <w:highlight w:val="yellow"/>
-              </w:rPr>
-              <w:t>[PLACEHOLDER]</w:t>
-            </w:r>
-          </w:p>
-        </w:tc>
-      </w:tr>
-    </w:tbl>
-    <w:p/>
     <w:p>
-      <w:pPr>
-        <w:pStyle w:val="Heading2"/>
-      </w:pPr>
-      <w:r>
-        <w:t>My specific contribution</w:t>
-      </w:r>
-    </w:p>
-    <w:p>
       <w:r>
         <w:rPr>
           <w:b w:val="0"/>
-          <w:highlight w:val="yellow"/>
-        </w:rPr>
-        <w:t>[PLACEHOLDER: describe in your own words what you did. Examples of the kind of detail to give: which deliverables you worked on, decisions you made or proposed, problems you found and fixed.]</w:t>
-      </w:r>
-    </w:p>
-    <w:p>
-      <w:pPr>
-        <w:pStyle w:val="Heading2"/>
-      </w:pPr>
-      <w:r>
-        <w:t>Evidence</w:t>
+        </w:rPr>
+        <w:t xml:space="preserve">Roles are a </w:t>
+      </w:r>
+      <w:r>
+        <w:rPr>
+          <w:b/>
+        </w:rPr>
+        <w:t>proposal, assigned at random</w:t>
+      </w:r>
+      <w:r>
+        <w:rPr>
+          <w:b w:val="0"/>
+        </w:rPr>
+        <w:t xml:space="preserve">, for members to confirm or swap. See </w:t>
+      </w:r>
+      <w:r>
+        <w:rPr>
+          <w:rFonts w:ascii="Consolas" w:hAnsi="Consolas"/>
+          <w:b w:val="0"/>
+        </w:rPr>
+        <w:t>docs/team_roles.md</w:t>
+      </w:r>
+      <w:r>
+        <w:rPr>
+          <w:b w:val="0"/>
+        </w:rPr>
+        <w:t xml:space="preserve"> for the planned responsibilities of each role.</w:t>
       </w:r>
     </w:p>
     <w:tbl>
@@ -10769,7 +10318,7 @@
       <w:tr>
         <w:tc>
           <w:tcPr>
-            <w:tcW w:type="dxa" w:w="3522"/>
+            <w:tcW w:type="dxa" w:w="3890"/>
             <w:shd w:val="clear" w:color="auto" w:fill="D9E2F3"/>
           </w:tcPr>
           <w:p>
@@ -10783,13 +10332,13 @@
                 <w:b/>
                 <w:sz w:val="18"/>
               </w:rPr>
-              <w:t>Evidence</w:t>
-            </w:r>
-          </w:p>
-        </w:tc>
-        <w:tc>
-          <w:tcPr>
-            <w:tcW w:type="dxa" w:w="5889"/>
+              <w:t>Name</w:t>
+            </w:r>
+          </w:p>
+        </w:tc>
+        <w:tc>
+          <w:tcPr>
+            <w:tcW w:type="dxa" w:w="5521"/>
             <w:shd w:val="clear" w:color="auto" w:fill="D9E2F3"/>
           </w:tcPr>
           <w:p>
@@ -10803,7 +10352,7 @@
                 <w:b/>
                 <w:sz w:val="18"/>
               </w:rPr>
-              <w:t>Where to find it</w:t>
+              <w:t>Proposed role (to be confirmed)</w:t>
             </w:r>
           </w:p>
         </w:tc>
@@ -10811,30 +10360,29 @@
       <w:tr>
         <w:tc>
           <w:tcPr>
-            <w:tcW w:type="dxa" w:w="3522"/>
-          </w:tcPr>
-          <w:p>
-            <w:r>
-              <w:rPr>
-                <w:b w:val="0"/>
-                <w:sz w:val="18"/>
-              </w:rPr>
-              <w:t>Git commits</w:t>
-            </w:r>
-          </w:p>
-        </w:tc>
-        <w:tc>
-          <w:tcPr>
-            <w:tcW w:type="dxa" w:w="5889"/>
-          </w:tcPr>
-          <w:p>
-            <w:r>
-              <w:rPr>
-                <w:b w:val="0"/>
-                <w:sz w:val="18"/>
-                <w:highlight w:val="yellow"/>
-              </w:rPr>
-              <w:t>[PLACEHOLDER: e.g. output of "git log --oneline" or the GitHub commit history link]</w:t>
+            <w:tcW w:type="dxa" w:w="3890"/>
+          </w:tcPr>
+          <w:p>
+            <w:r>
+              <w:rPr>
+                <w:b w:val="0"/>
+                <w:sz w:val="18"/>
+              </w:rPr>
+              <w:t>KAZIBWE BENJAMIN</w:t>
+            </w:r>
+          </w:p>
+        </w:tc>
+        <w:tc>
+          <w:tcPr>
+            <w:tcW w:type="dxa" w:w="5521"/>
+          </w:tcPr>
+          <w:p>
+            <w:r>
+              <w:rPr>
+                <w:b w:val="0"/>
+                <w:sz w:val="18"/>
+              </w:rPr>
+              <w:t>Project coordinator and employer liaison</w:t>
             </w:r>
           </w:p>
         </w:tc>
@@ -10842,30 +10390,29 @@
       <w:tr>
         <w:tc>
           <w:tcPr>
-            <w:tcW w:type="dxa" w:w="3522"/>
-          </w:tcPr>
-          <w:p>
-            <w:r>
-              <w:rPr>
-                <w:b w:val="0"/>
-                <w:sz w:val="18"/>
-              </w:rPr>
-              <w:t>Files I worked on</w:t>
-            </w:r>
-          </w:p>
-        </w:tc>
-        <w:tc>
-          <w:tcPr>
-            <w:tcW w:type="dxa" w:w="5889"/>
-          </w:tcPr>
-          <w:p>
-            <w:r>
-              <w:rPr>
-                <w:b w:val="0"/>
-                <w:sz w:val="18"/>
-                <w:highlight w:val="yellow"/>
-              </w:rPr>
-              <w:t>[PLACEHOLDER]</w:t>
+            <w:tcW w:type="dxa" w:w="3890"/>
+          </w:tcPr>
+          <w:p>
+            <w:r>
+              <w:rPr>
+                <w:b w:val="0"/>
+                <w:sz w:val="18"/>
+              </w:rPr>
+              <w:t>NAMUSANA REBECCA</w:t>
+            </w:r>
+          </w:p>
+        </w:tc>
+        <w:tc>
+          <w:tcPr>
+            <w:tcW w:type="dxa" w:w="5521"/>
+          </w:tcPr>
+          <w:p>
+            <w:r>
+              <w:rPr>
+                <w:b w:val="0"/>
+                <w:sz w:val="18"/>
+              </w:rPr>
+              <w:t>Recommendation relevance testing</w:t>
             </w:r>
           </w:p>
         </w:tc>
@@ -10873,30 +10420,329 @@
       <w:tr>
         <w:tc>
           <w:tcPr>
-            <w:tcW w:type="dxa" w:w="3522"/>
-          </w:tcPr>
-          <w:p>
-            <w:r>
-              <w:rPr>
-                <w:b w:val="0"/>
-                <w:sz w:val="18"/>
-              </w:rPr>
-              <w:t>Meetings / discussions</w:t>
-            </w:r>
-          </w:p>
-        </w:tc>
-        <w:tc>
-          <w:tcPr>
-            <w:tcW w:type="dxa" w:w="5889"/>
-          </w:tcPr>
-          <w:p>
-            <w:r>
-              <w:rPr>
-                <w:b w:val="0"/>
-                <w:sz w:val="18"/>
-                <w:highlight w:val="yellow"/>
-              </w:rPr>
-              <w:t>[PLACEHOLDER]</w:t>
+            <w:tcW w:type="dxa" w:w="3890"/>
+          </w:tcPr>
+          <w:p>
+            <w:r>
+              <w:rPr>
+                <w:b w:val="0"/>
+                <w:sz w:val="18"/>
+              </w:rPr>
+              <w:t>CHOL MANGONG AJAL BOL</w:t>
+            </w:r>
+          </w:p>
+        </w:tc>
+        <w:tc>
+          <w:tcPr>
+            <w:tcW w:type="dxa" w:w="5521"/>
+          </w:tcPr>
+          <w:p>
+            <w:r>
+              <w:rPr>
+                <w:b w:val="0"/>
+                <w:sz w:val="18"/>
+              </w:rPr>
+              <w:t>Data lead</w:t>
+            </w:r>
+          </w:p>
+        </w:tc>
+      </w:tr>
+      <w:tr>
+        <w:tc>
+          <w:tcPr>
+            <w:tcW w:type="dxa" w:w="3890"/>
+          </w:tcPr>
+          <w:p>
+            <w:r>
+              <w:rPr>
+                <w:b w:val="0"/>
+                <w:sz w:val="18"/>
+              </w:rPr>
+              <w:t>KAWUMA MICHAEL</w:t>
+            </w:r>
+          </w:p>
+        </w:tc>
+        <w:tc>
+          <w:tcPr>
+            <w:tcW w:type="dxa" w:w="5521"/>
+          </w:tcPr>
+          <w:p>
+            <w:r>
+              <w:rPr>
+                <w:b w:val="0"/>
+                <w:sz w:val="18"/>
+              </w:rPr>
+              <w:t>Legal knowledge sources and retrieval</w:t>
+            </w:r>
+          </w:p>
+        </w:tc>
+      </w:tr>
+      <w:tr>
+        <w:tc>
+          <w:tcPr>
+            <w:tcW w:type="dxa" w:w="3890"/>
+          </w:tcPr>
+          <w:p>
+            <w:r>
+              <w:rPr>
+                <w:b w:val="0"/>
+                <w:sz w:val="18"/>
+              </w:rPr>
+              <w:t>Mustapha suleiman Ali</w:t>
+            </w:r>
+          </w:p>
+        </w:tc>
+        <w:tc>
+          <w:tcPr>
+            <w:tcW w:type="dxa" w:w="5521"/>
+          </w:tcPr>
+          <w:p>
+            <w:r>
+              <w:rPr>
+                <w:b w:val="0"/>
+                <w:sz w:val="18"/>
+              </w:rPr>
+              <w:t>Integration and API</w:t>
+            </w:r>
+          </w:p>
+        </w:tc>
+      </w:tr>
+      <w:tr>
+        <w:tc>
+          <w:tcPr>
+            <w:tcW w:type="dxa" w:w="3890"/>
+          </w:tcPr>
+          <w:p>
+            <w:r>
+              <w:rPr>
+                <w:b w:val="0"/>
+                <w:sz w:val="18"/>
+              </w:rPr>
+              <w:t>NAZIF SABO DANLADI</w:t>
+            </w:r>
+          </w:p>
+        </w:tc>
+        <w:tc>
+          <w:tcPr>
+            <w:tcW w:type="dxa" w:w="5521"/>
+          </w:tcPr>
+          <w:p>
+            <w:r>
+              <w:rPr>
+                <w:b w:val="0"/>
+                <w:sz w:val="18"/>
+              </w:rPr>
+              <w:t>Legal decision support lead</w:t>
+            </w:r>
+          </w:p>
+        </w:tc>
+      </w:tr>
+      <w:tr>
+        <w:tc>
+          <w:tcPr>
+            <w:tcW w:type="dxa" w:w="3890"/>
+          </w:tcPr>
+          <w:p>
+            <w:r>
+              <w:rPr>
+                <w:b w:val="0"/>
+                <w:sz w:val="18"/>
+              </w:rPr>
+              <w:t>Henok Tesfahiwet Lbab Fidel</w:t>
+            </w:r>
+          </w:p>
+        </w:tc>
+        <w:tc>
+          <w:tcPr>
+            <w:tcW w:type="dxa" w:w="5521"/>
+          </w:tcPr>
+          <w:p>
+            <w:r>
+              <w:rPr>
+                <w:b w:val="0"/>
+                <w:sz w:val="18"/>
+              </w:rPr>
+              <w:t>Text classifier lead</w:t>
+            </w:r>
+          </w:p>
+        </w:tc>
+      </w:tr>
+      <w:tr>
+        <w:tc>
+          <w:tcPr>
+            <w:tcW w:type="dxa" w:w="3890"/>
+          </w:tcPr>
+          <w:p>
+            <w:r>
+              <w:rPr>
+                <w:b w:val="0"/>
+                <w:sz w:val="18"/>
+              </w:rPr>
+              <w:t>BIYINZIKA EMMANUEL ONYUTA</w:t>
+            </w:r>
+          </w:p>
+        </w:tc>
+        <w:tc>
+          <w:tcPr>
+            <w:tcW w:type="dxa" w:w="5521"/>
+          </w:tcPr>
+          <w:p>
+            <w:r>
+              <w:rPr>
+                <w:b w:val="0"/>
+                <w:sz w:val="18"/>
+              </w:rPr>
+              <w:t>Data preparation and labelling</w:t>
+            </w:r>
+          </w:p>
+        </w:tc>
+      </w:tr>
+      <w:tr>
+        <w:tc>
+          <w:tcPr>
+            <w:tcW w:type="dxa" w:w="3890"/>
+          </w:tcPr>
+          <w:p>
+            <w:r>
+              <w:rPr>
+                <w:b w:val="0"/>
+                <w:sz w:val="18"/>
+              </w:rPr>
+              <w:t>TWIJUKYE DISMAS</w:t>
+            </w:r>
+          </w:p>
+        </w:tc>
+        <w:tc>
+          <w:tcPr>
+            <w:tcW w:type="dxa" w:w="5521"/>
+          </w:tcPr>
+          <w:p>
+            <w:r>
+              <w:rPr>
+                <w:b w:val="0"/>
+                <w:sz w:val="18"/>
+              </w:rPr>
+              <w:t>Safety, testing and quality assurance</w:t>
+            </w:r>
+          </w:p>
+        </w:tc>
+      </w:tr>
+      <w:tr>
+        <w:tc>
+          <w:tcPr>
+            <w:tcW w:type="dxa" w:w="3890"/>
+          </w:tcPr>
+          <w:p>
+            <w:r>
+              <w:rPr>
+                <w:b w:val="0"/>
+                <w:sz w:val="18"/>
+              </w:rPr>
+              <w:t>NASSEJJE RACHEAL</w:t>
+            </w:r>
+          </w:p>
+        </w:tc>
+        <w:tc>
+          <w:tcPr>
+            <w:tcW w:type="dxa" w:w="5521"/>
+          </w:tcPr>
+          <w:p>
+            <w:r>
+              <w:rPr>
+                <w:b w:val="0"/>
+                <w:sz w:val="18"/>
+              </w:rPr>
+              <w:t>Chatbot lead</w:t>
+            </w:r>
+          </w:p>
+        </w:tc>
+      </w:tr>
+      <w:tr>
+        <w:tc>
+          <w:tcPr>
+            <w:tcW w:type="dxa" w:w="3890"/>
+          </w:tcPr>
+          <w:p>
+            <w:r>
+              <w:rPr>
+                <w:b w:val="0"/>
+                <w:sz w:val="18"/>
+              </w:rPr>
+              <w:t>ATUHAIRE LYNNET</w:t>
+            </w:r>
+          </w:p>
+        </w:tc>
+        <w:tc>
+          <w:tcPr>
+            <w:tcW w:type="dxa" w:w="5521"/>
+          </w:tcPr>
+          <w:p>
+            <w:r>
+              <w:rPr>
+                <w:b w:val="0"/>
+                <w:sz w:val="18"/>
+              </w:rPr>
+              <w:t>Recommendation system lead</w:t>
+            </w:r>
+          </w:p>
+        </w:tc>
+      </w:tr>
+      <w:tr>
+        <w:tc>
+          <w:tcPr>
+            <w:tcW w:type="dxa" w:w="3890"/>
+          </w:tcPr>
+          <w:p>
+            <w:r>
+              <w:rPr>
+                <w:b w:val="0"/>
+                <w:sz w:val="18"/>
+              </w:rPr>
+              <w:t>TUGUME ANDREW</w:t>
+            </w:r>
+          </w:p>
+        </w:tc>
+        <w:tc>
+          <w:tcPr>
+            <w:tcW w:type="dxa" w:w="5521"/>
+          </w:tcPr>
+          <w:p>
+            <w:r>
+              <w:rPr>
+                <w:b w:val="0"/>
+                <w:sz w:val="18"/>
+              </w:rPr>
+              <w:t>Model evaluation and error analysis</w:t>
+            </w:r>
+          </w:p>
+        </w:tc>
+      </w:tr>
+      <w:tr>
+        <w:tc>
+          <w:tcPr>
+            <w:tcW w:type="dxa" w:w="3890"/>
+          </w:tcPr>
+          <w:p>
+            <w:r>
+              <w:rPr>
+                <w:b w:val="0"/>
+                <w:sz w:val="18"/>
+              </w:rPr>
+              <w:t>Baboucarr A Bobb</w:t>
+            </w:r>
+          </w:p>
+        </w:tc>
+        <w:tc>
+          <w:tcPr>
+            <w:tcW w:type="dxa" w:w="5521"/>
+          </w:tcPr>
+          <w:p>
+            <w:r>
+              <w:rPr>
+                <w:b w:val="0"/>
+                <w:sz w:val="18"/>
+              </w:rPr>
+              <w:t>Requirements and documentation lead</w:t>
             </w:r>
           </w:p>
         </w:tc>
@@ -10908,48 +10754,16 @@
         <w:pStyle w:val="Heading2"/>
       </w:pPr>
       <w:r>
-        <w:t>Use of AI assistance</w:t>
+        <w:t>My specific contribution</w:t>
       </w:r>
     </w:p>
     <w:p>
       <w:r>
         <w:rPr>
           <w:b w:val="0"/>
-        </w:rPr>
-        <w:t xml:space="preserve">This repository was developed with the help of an AI coding assistant (Claude, by Anthropic). Commits made with its help carry a </w:t>
-      </w:r>
-      <w:r>
-        <w:rPr>
-          <w:rFonts w:ascii="Consolas" w:hAnsi="Consolas"/>
-          <w:b w:val="0"/>
-        </w:rPr>
-        <w:t>Co-Authored-By: Claude</w:t>
-      </w:r>
-      <w:r>
-        <w:rPr>
-          <w:b w:val="0"/>
-        </w:rPr>
-        <w:t xml:space="preserve"> line, and the synthetic dataset was written with AI assistance (see </w:t>
-      </w:r>
-      <w:r>
-        <w:rPr>
-          <w:rFonts w:ascii="Consolas" w:hAnsi="Consolas"/>
-          <w:b w:val="0"/>
-        </w:rPr>
-        <w:t>data/README.md</w:t>
-      </w:r>
-      <w:r>
-        <w:rPr>
-          <w:b w:val="0"/>
-        </w:rPr>
-        <w:t xml:space="preserve">). </w:t>
-      </w:r>
-      <w:r>
-        <w:rPr>
-          <w:b w:val="0"/>
           <w:highlight w:val="yellow"/>
         </w:rPr>
-        <w:t>[PLACEHOLDER: describe how you directed, checked and understood the AI-assisted work, in line with your course's policy on AI use.]</w:t>
+        <w:t>[PLACEHOLDER: describe in your own words what you did. Examples of the kind of detail to give: which deliverables you worked on, decisions you made or proposed, problems you found and fixed.]</w:t>
       </w:r>
     </w:p>
     <w:p>
@@ -10957,18 +10771,1398 @@
         <w:pStyle w:val="Heading2"/>
       </w:pPr>
       <w:r>
-        <w:t>Understanding of the complete solution</w:t>
+        <w:t>Evidence</w:t>
+      </w:r>
+    </w:p>
+    <w:tbl>
+      <w:tblPr>
+        <w:tblStyle w:val="TableGrid"/>
+        <w:tblW w:type="auto" w:w="0"/>
+        <w:jc w:val="center"/>
+        <w:tblLayout w:type="fixed"/>
+        <w:tblLook w:firstColumn="1" w:firstRow="1" w:lastColumn="0" w:lastRow="0" w:noHBand="0" w:noVBand="1" w:val="04A0"/>
+      </w:tblPr>
+      <w:tblGrid>
+        <w:gridCol w:w="4873"/>
+        <w:gridCol w:w="4873"/>
+      </w:tblGrid>
+      <w:tr>
+        <w:tc>
+          <w:tcPr>
+            <w:tcW w:type="dxa" w:w="3522"/>
+            <w:shd w:val="clear" w:color="auto" w:fill="D9E2F3"/>
+          </w:tcPr>
+          <w:p>
+            <w:r>
+              <w:rPr>
+                <w:sz w:val="18"/>
+              </w:rPr>
+            </w:r>
+            <w:r>
+              <w:rPr>
+                <w:b/>
+                <w:sz w:val="18"/>
+              </w:rPr>
+              <w:t>Evidence</w:t>
+            </w:r>
+          </w:p>
+        </w:tc>
+        <w:tc>
+          <w:tcPr>
+            <w:tcW w:type="dxa" w:w="5889"/>
+            <w:shd w:val="clear" w:color="auto" w:fill="D9E2F3"/>
+          </w:tcPr>
+          <w:p>
+            <w:r>
+              <w:rPr>
+                <w:sz w:val="18"/>
+              </w:rPr>
+            </w:r>
+            <w:r>
+              <w:rPr>
+                <w:b/>
+                <w:sz w:val="18"/>
+              </w:rPr>
+              <w:t>Where to find it</w:t>
+            </w:r>
+          </w:p>
+        </w:tc>
+      </w:tr>
+      <w:tr>
+        <w:tc>
+          <w:tcPr>
+            <w:tcW w:type="dxa" w:w="3522"/>
+          </w:tcPr>
+          <w:p>
+            <w:r>
+              <w:rPr>
+                <w:b w:val="0"/>
+                <w:sz w:val="18"/>
+              </w:rPr>
+              <w:t>Git commits</w:t>
+            </w:r>
+          </w:p>
+        </w:tc>
+        <w:tc>
+          <w:tcPr>
+            <w:tcW w:type="dxa" w:w="5889"/>
+          </w:tcPr>
+          <w:p>
+            <w:r>
+              <w:rPr>
+                <w:b w:val="0"/>
+                <w:sz w:val="18"/>
+                <w:highlight w:val="yellow"/>
+              </w:rPr>
+              <w:t>[PLACEHOLDER: e.g. output of "git log --oneline" or the GitHub commit history link]</w:t>
+            </w:r>
+          </w:p>
+        </w:tc>
+      </w:tr>
+      <w:tr>
+        <w:tc>
+          <w:tcPr>
+            <w:tcW w:type="dxa" w:w="3522"/>
+          </w:tcPr>
+          <w:p>
+            <w:r>
+              <w:rPr>
+                <w:b w:val="0"/>
+                <w:sz w:val="18"/>
+              </w:rPr>
+              <w:t>Files I worked on</w:t>
+            </w:r>
+          </w:p>
+        </w:tc>
+        <w:tc>
+          <w:tcPr>
+            <w:tcW w:type="dxa" w:w="5889"/>
+          </w:tcPr>
+          <w:p>
+            <w:r>
+              <w:rPr>
+                <w:b w:val="0"/>
+                <w:sz w:val="18"/>
+                <w:highlight w:val="yellow"/>
+              </w:rPr>
+              <w:t>[PLACEHOLDER]</w:t>
+            </w:r>
+          </w:p>
+        </w:tc>
+      </w:tr>
+      <w:tr>
+        <w:tc>
+          <w:tcPr>
+            <w:tcW w:type="dxa" w:w="3522"/>
+          </w:tcPr>
+          <w:p>
+            <w:r>
+              <w:rPr>
+                <w:b w:val="0"/>
+                <w:sz w:val="18"/>
+              </w:rPr>
+              <w:t>Meetings / discussions</w:t>
+            </w:r>
+          </w:p>
+        </w:tc>
+        <w:tc>
+          <w:tcPr>
+            <w:tcW w:type="dxa" w:w="5889"/>
+          </w:tcPr>
+          <w:p>
+            <w:r>
+              <w:rPr>
+                <w:b w:val="0"/>
+                <w:sz w:val="18"/>
+                <w:highlight w:val="yellow"/>
+              </w:rPr>
+              <w:t>[PLACEHOLDER]</w:t>
+            </w:r>
+          </w:p>
+        </w:tc>
+      </w:tr>
+    </w:tbl>
+    <w:p/>
+    <w:p>
+      <w:pPr>
+        <w:pStyle w:val="Heading2"/>
+      </w:pPr>
+      <w:r>
+        <w:t>Use of AI assistance</w:t>
       </w:r>
     </w:p>
     <w:p>
       <w:r>
         <w:rPr>
           <w:b w:val="0"/>
+        </w:rPr>
+        <w:t xml:space="preserve">This repository was developed with the help of an AI coding assistant (Claude, by Anthropic). Commits made with its help carry a </w:t>
+      </w:r>
+      <w:r>
+        <w:rPr>
+          <w:rFonts w:ascii="Consolas" w:hAnsi="Consolas"/>
+          <w:b w:val="0"/>
+        </w:rPr>
+        <w:t>Co-Authored-By: Claude</w:t>
+      </w:r>
+      <w:r>
+        <w:rPr>
+          <w:b w:val="0"/>
+        </w:rPr>
+        <w:t xml:space="preserve"> line, and the synthetic dataset was written with AI assistance (see </w:t>
+      </w:r>
+      <w:r>
+        <w:rPr>
+          <w:rFonts w:ascii="Consolas" w:hAnsi="Consolas"/>
+          <w:b w:val="0"/>
+        </w:rPr>
+        <w:t>data/README.md</w:t>
+      </w:r>
+      <w:r>
+        <w:rPr>
+          <w:b w:val="0"/>
+        </w:rPr>
+        <w:t xml:space="preserve">). </w:t>
+      </w:r>
+      <w:r>
+        <w:rPr>
+          <w:b w:val="0"/>
           <w:highlight w:val="yellow"/>
         </w:rPr>
+        <w:t>[PLACEHOLDER: describe how you directed, checked and understood the AI-assisted work, in line with your course's policy on AI use.]</w:t>
+      </w:r>
+    </w:p>
+    <w:p>
+      <w:pPr>
+        <w:pStyle w:val="Heading2"/>
+      </w:pPr>
+      <w:r>
+        <w:t>Understanding of the complete solution</w:t>
+      </w:r>
+    </w:p>
+    <w:p>
+      <w:r>
+        <w:rPr>
+          <w:b w:val="0"/>
+          <w:highlight w:val="yellow"/>
+        </w:rPr>
         <w:t>[PLACEHOLDER: in your own words, explain how the text classifier connects to retrieval, decision support, recommendation and the chatbot (see docs/architecture.md).]</w:t>
       </w:r>
     </w:p>
+    <w:p>
+      <w:pPr>
+        <w:pStyle w:val="Heading2"/>
+      </w:pPr>
+      <w:r>
+        <w:t>Proposed team role allocation</w:t>
+      </w:r>
+    </w:p>
+    <w:p>
+      <w:pPr>
+        <w:pStyle w:val="IntenseQuote"/>
+      </w:pPr>
+      <w:r>
+        <w:rPr>
+          <w:b/>
+        </w:rPr>
+        <w:t>Status: PROPOSAL.</w:t>
+      </w:r>
+      <w:r>
+        <w:rPr>
+          <w:b w:val="0"/>
+        </w:rPr>
+        <w:t xml:space="preserve"> These roles were assigned </w:t>
+      </w:r>
+      <w:r>
+        <w:rPr>
+          <w:b/>
+        </w:rPr>
+        <w:t>at random</w:t>
+      </w:r>
+      <w:r>
+        <w:rPr>
+          <w:b w:val="0"/>
+        </w:rPr>
+        <w:t xml:space="preserve"> so the group has a starting point. They describe </w:t>
+      </w:r>
+      <w:r>
+        <w:rPr>
+          <w:b/>
+        </w:rPr>
+        <w:t>planned</w:t>
+      </w:r>
+      <w:r>
+        <w:rPr>
+          <w:b w:val="0"/>
+        </w:rPr>
+        <w:t xml:space="preserve"> responsibilities for the 4-week project, not work already done. Each member should confirm, swap or change their role in a group meeting. Each member must still write their </w:t>
+      </w:r>
+      <w:r>
+        <w:rPr>
+          <w:b/>
+        </w:rPr>
+        <w:t>own</w:t>
+      </w:r>
+      <w:r>
+        <w:rPr>
+          <w:b w:val="0"/>
+        </w:rPr>
+        <w:t xml:space="preserve"> contribution statement describing what they actually did.</w:t>
+      </w:r>
+    </w:p>
+    <w:p>
+      <w:r>
+        <w:rPr>
+          <w:b/>
+        </w:rPr>
+        <w:t>How the roles were assigned:</w:t>
+      </w:r>
+      <w:r>
+        <w:rPr>
+          <w:b w:val="0"/>
+        </w:rPr>
+        <w:t xml:space="preserve"> the 13 roles below were matched to the 13 members with a seeded random shuffle (</w:t>
+      </w:r>
+      <w:r>
+        <w:rPr>
+          <w:rFonts w:ascii="Consolas" w:hAnsi="Consolas"/>
+          <w:b w:val="0"/>
+        </w:rPr>
+        <w:t>random.Random(2026).shuffle</w:t>
+      </w:r>
+      <w:r>
+        <w:rPr>
+          <w:b w:val="0"/>
+        </w:rPr>
+        <w:t>, Python), so the allocation is fair and reproducible.</w:t>
+      </w:r>
+    </w:p>
+    <w:p>
+      <w:r>
+        <w:rPr>
+          <w:b w:val="0"/>
+        </w:rPr>
+        <w:t>The roles cover the four workstreams in the lecturer note (text classification, legal decision support, recommendation system, chatbot) plus the shared work every project needs.</w:t>
+      </w:r>
+    </w:p>
+    <w:tbl>
+      <w:tblPr>
+        <w:tblStyle w:val="TableGrid"/>
+        <w:tblW w:type="auto" w:w="0"/>
+        <w:jc w:val="center"/>
+        <w:tblLayout w:type="fixed"/>
+        <w:tblLook w:firstColumn="1" w:firstRow="1" w:lastColumn="0" w:lastRow="0" w:noHBand="0" w:noVBand="1" w:val="04A0"/>
+      </w:tblPr>
+      <w:tblGrid>
+        <w:gridCol w:w="1949"/>
+        <w:gridCol w:w="1949"/>
+        <w:gridCol w:w="1949"/>
+        <w:gridCol w:w="1949"/>
+        <w:gridCol w:w="1949"/>
+      </w:tblGrid>
+      <w:tr>
+        <w:tc>
+          <w:tcPr>
+            <w:tcW w:type="dxa" w:w="420"/>
+            <w:shd w:val="clear" w:color="auto" w:fill="D9E2F3"/>
+          </w:tcPr>
+          <w:p>
+            <w:r>
+              <w:rPr>
+                <w:sz w:val="18"/>
+              </w:rPr>
+            </w:r>
+            <w:r>
+              <w:rPr>
+                <w:b/>
+                <w:sz w:val="18"/>
+              </w:rPr>
+              <w:t>#</w:t>
+            </w:r>
+          </w:p>
+        </w:tc>
+        <w:tc>
+          <w:tcPr>
+            <w:tcW w:type="dxa" w:w="2148"/>
+            <w:shd w:val="clear" w:color="auto" w:fill="D9E2F3"/>
+          </w:tcPr>
+          <w:p>
+            <w:r>
+              <w:rPr>
+                <w:sz w:val="18"/>
+              </w:rPr>
+            </w:r>
+            <w:r>
+              <w:rPr>
+                <w:b/>
+                <w:sz w:val="18"/>
+              </w:rPr>
+              <w:t>Proposed role</w:t>
+            </w:r>
+          </w:p>
+        </w:tc>
+        <w:tc>
+          <w:tcPr>
+            <w:tcW w:type="dxa" w:w="1767"/>
+            <w:shd w:val="clear" w:color="auto" w:fill="D9E2F3"/>
+          </w:tcPr>
+          <w:p>
+            <w:r>
+              <w:rPr>
+                <w:sz w:val="18"/>
+              </w:rPr>
+            </w:r>
+            <w:r>
+              <w:rPr>
+                <w:b/>
+                <w:sz w:val="18"/>
+              </w:rPr>
+              <w:t>Workstream</w:t>
+            </w:r>
+          </w:p>
+        </w:tc>
+        <w:tc>
+          <w:tcPr>
+            <w:tcW w:type="dxa" w:w="3563"/>
+            <w:shd w:val="clear" w:color="auto" w:fill="D9E2F3"/>
+          </w:tcPr>
+          <w:p>
+            <w:r>
+              <w:rPr>
+                <w:sz w:val="18"/>
+              </w:rPr>
+            </w:r>
+            <w:r>
+              <w:rPr>
+                <w:b/>
+                <w:sz w:val="18"/>
+              </w:rPr>
+              <w:t>Planned responsibilities</w:t>
+            </w:r>
+          </w:p>
+        </w:tc>
+        <w:tc>
+          <w:tcPr>
+            <w:tcW w:type="dxa" w:w="1513"/>
+            <w:shd w:val="clear" w:color="auto" w:fill="D9E2F3"/>
+          </w:tcPr>
+          <w:p>
+            <w:r>
+              <w:rPr>
+                <w:sz w:val="18"/>
+              </w:rPr>
+            </w:r>
+            <w:r>
+              <w:rPr>
+                <w:b/>
+                <w:sz w:val="18"/>
+              </w:rPr>
+              <w:t>Assigned to</w:t>
+            </w:r>
+          </w:p>
+        </w:tc>
+      </w:tr>
+      <w:tr>
+        <w:tc>
+          <w:tcPr>
+            <w:tcW w:type="dxa" w:w="420"/>
+          </w:tcPr>
+          <w:p>
+            <w:r>
+              <w:rPr>
+                <w:b w:val="0"/>
+                <w:sz w:val="18"/>
+              </w:rPr>
+              <w:t>1</w:t>
+            </w:r>
+          </w:p>
+        </w:tc>
+        <w:tc>
+          <w:tcPr>
+            <w:tcW w:type="dxa" w:w="2148"/>
+          </w:tcPr>
+          <w:p>
+            <w:r>
+              <w:rPr>
+                <w:b w:val="0"/>
+                <w:sz w:val="18"/>
+              </w:rPr>
+              <w:t>Project coordinator and employer liaison</w:t>
+            </w:r>
+          </w:p>
+        </w:tc>
+        <w:tc>
+          <w:tcPr>
+            <w:tcW w:type="dxa" w:w="1767"/>
+          </w:tcPr>
+          <w:p>
+            <w:r>
+              <w:rPr>
+                <w:b w:val="0"/>
+                <w:sz w:val="18"/>
+              </w:rPr>
+              <w:t>All</w:t>
+            </w:r>
+          </w:p>
+        </w:tc>
+        <w:tc>
+          <w:tcPr>
+            <w:tcW w:type="dxa" w:w="3563"/>
+          </w:tcPr>
+          <w:p>
+            <w:r>
+              <w:rPr>
+                <w:b w:val="0"/>
+                <w:sz w:val="18"/>
+              </w:rPr>
+              <w:t>Run group meetings, track the plan, lead communication with Kimuntu Power Inc. and the lecturer, work through the employer discussion checklist</w:t>
+            </w:r>
+          </w:p>
+        </w:tc>
+        <w:tc>
+          <w:tcPr>
+            <w:tcW w:type="dxa" w:w="1513"/>
+          </w:tcPr>
+          <w:p>
+            <w:r>
+              <w:rPr>
+                <w:b w:val="0"/>
+                <w:sz w:val="18"/>
+              </w:rPr>
+              <w:t>KAZIBWE BENJAMIN</w:t>
+            </w:r>
+          </w:p>
+        </w:tc>
+      </w:tr>
+      <w:tr>
+        <w:tc>
+          <w:tcPr>
+            <w:tcW w:type="dxa" w:w="420"/>
+          </w:tcPr>
+          <w:p>
+            <w:r>
+              <w:rPr>
+                <w:b w:val="0"/>
+                <w:sz w:val="18"/>
+              </w:rPr>
+              <w:t>2</w:t>
+            </w:r>
+          </w:p>
+        </w:tc>
+        <w:tc>
+          <w:tcPr>
+            <w:tcW w:type="dxa" w:w="2148"/>
+          </w:tcPr>
+          <w:p>
+            <w:r>
+              <w:rPr>
+                <w:b w:val="0"/>
+                <w:sz w:val="18"/>
+              </w:rPr>
+              <w:t>Requirements and documentation lead</w:t>
+            </w:r>
+          </w:p>
+        </w:tc>
+        <w:tc>
+          <w:tcPr>
+            <w:tcW w:type="dxa" w:w="1767"/>
+          </w:tcPr>
+          <w:p>
+            <w:r>
+              <w:rPr>
+                <w:b w:val="0"/>
+                <w:sz w:val="18"/>
+              </w:rPr>
+              <w:t>All</w:t>
+            </w:r>
+          </w:p>
+        </w:tc>
+        <w:tc>
+          <w:tcPr>
+            <w:tcW w:type="dxa" w:w="3563"/>
+          </w:tcPr>
+          <w:p>
+            <w:r>
+              <w:rPr>
+                <w:b w:val="0"/>
+                <w:sz w:val="18"/>
+              </w:rPr>
+              <w:t>Record agreed requirements and decisions, maintain the docs and the Word report, keep the README current</w:t>
+            </w:r>
+          </w:p>
+        </w:tc>
+        <w:tc>
+          <w:tcPr>
+            <w:tcW w:type="dxa" w:w="1513"/>
+          </w:tcPr>
+          <w:p>
+            <w:r>
+              <w:rPr>
+                <w:b w:val="0"/>
+                <w:sz w:val="18"/>
+              </w:rPr>
+              <w:t>Baboucarr A Bobb</w:t>
+            </w:r>
+          </w:p>
+        </w:tc>
+      </w:tr>
+      <w:tr>
+        <w:tc>
+          <w:tcPr>
+            <w:tcW w:type="dxa" w:w="420"/>
+          </w:tcPr>
+          <w:p>
+            <w:r>
+              <w:rPr>
+                <w:b w:val="0"/>
+                <w:sz w:val="18"/>
+              </w:rPr>
+              <w:t>3</w:t>
+            </w:r>
+          </w:p>
+        </w:tc>
+        <w:tc>
+          <w:tcPr>
+            <w:tcW w:type="dxa" w:w="2148"/>
+          </w:tcPr>
+          <w:p>
+            <w:r>
+              <w:rPr>
+                <w:b w:val="0"/>
+                <w:sz w:val="18"/>
+              </w:rPr>
+              <w:t>Data lead</w:t>
+            </w:r>
+          </w:p>
+        </w:tc>
+        <w:tc>
+          <w:tcPr>
+            <w:tcW w:type="dxa" w:w="1767"/>
+          </w:tcPr>
+          <w:p>
+            <w:r>
+              <w:rPr>
+                <w:b w:val="0"/>
+                <w:sz w:val="18"/>
+              </w:rPr>
+              <w:t>Text classification</w:t>
+            </w:r>
+          </w:p>
+        </w:tc>
+        <w:tc>
+          <w:tcPr>
+            <w:tcW w:type="dxa" w:w="3563"/>
+          </w:tcPr>
+          <w:p>
+            <w:r>
+              <w:rPr>
+                <w:b w:val="0"/>
+                <w:sz w:val="18"/>
+              </w:rPr>
+              <w:t xml:space="preserve">Agree data access with Kimuntu, check dataset licences, maintain </w:t>
+            </w:r>
+            <w:r>
+              <w:rPr>
+                <w:rFonts w:ascii="Consolas" w:hAnsi="Consolas"/>
+                <w:b w:val="0"/>
+                <w:sz w:val="18"/>
+              </w:rPr>
+              <w:t>data/README.md</w:t>
+            </w:r>
+          </w:p>
+        </w:tc>
+        <w:tc>
+          <w:tcPr>
+            <w:tcW w:type="dxa" w:w="1513"/>
+          </w:tcPr>
+          <w:p>
+            <w:r>
+              <w:rPr>
+                <w:b w:val="0"/>
+                <w:sz w:val="18"/>
+              </w:rPr>
+              <w:t>CHOL MANGONG AJAL BOL</w:t>
+            </w:r>
+          </w:p>
+        </w:tc>
+      </w:tr>
+      <w:tr>
+        <w:tc>
+          <w:tcPr>
+            <w:tcW w:type="dxa" w:w="420"/>
+          </w:tcPr>
+          <w:p>
+            <w:r>
+              <w:rPr>
+                <w:b w:val="0"/>
+                <w:sz w:val="18"/>
+              </w:rPr>
+              <w:t>4</w:t>
+            </w:r>
+          </w:p>
+        </w:tc>
+        <w:tc>
+          <w:tcPr>
+            <w:tcW w:type="dxa" w:w="2148"/>
+          </w:tcPr>
+          <w:p>
+            <w:r>
+              <w:rPr>
+                <w:b w:val="0"/>
+                <w:sz w:val="18"/>
+              </w:rPr>
+              <w:t>Data preparation and labelling</w:t>
+            </w:r>
+          </w:p>
+        </w:tc>
+        <w:tc>
+          <w:tcPr>
+            <w:tcW w:type="dxa" w:w="1767"/>
+          </w:tcPr>
+          <w:p>
+            <w:r>
+              <w:rPr>
+                <w:b w:val="0"/>
+                <w:sz w:val="18"/>
+              </w:rPr>
+              <w:t>Text classification</w:t>
+            </w:r>
+          </w:p>
+        </w:tc>
+        <w:tc>
+          <w:tcPr>
+            <w:tcW w:type="dxa" w:w="3563"/>
+          </w:tcPr>
+          <w:p>
+            <w:r>
+              <w:rPr>
+                <w:b w:val="0"/>
+                <w:sz w:val="18"/>
+              </w:rPr>
+              <w:t>Review the tag mapping and labelling rules, review and extend the synthetic queries, fix label noise</w:t>
+            </w:r>
+          </w:p>
+        </w:tc>
+        <w:tc>
+          <w:tcPr>
+            <w:tcW w:type="dxa" w:w="1513"/>
+          </w:tcPr>
+          <w:p>
+            <w:r>
+              <w:rPr>
+                <w:b w:val="0"/>
+                <w:sz w:val="18"/>
+              </w:rPr>
+              <w:t>BIYINZIKA EMMANUEL ONYUTA</w:t>
+            </w:r>
+          </w:p>
+        </w:tc>
+      </w:tr>
+      <w:tr>
+        <w:tc>
+          <w:tcPr>
+            <w:tcW w:type="dxa" w:w="420"/>
+          </w:tcPr>
+          <w:p>
+            <w:r>
+              <w:rPr>
+                <w:b w:val="0"/>
+                <w:sz w:val="18"/>
+              </w:rPr>
+              <w:t>5</w:t>
+            </w:r>
+          </w:p>
+        </w:tc>
+        <w:tc>
+          <w:tcPr>
+            <w:tcW w:type="dxa" w:w="2148"/>
+          </w:tcPr>
+          <w:p>
+            <w:r>
+              <w:rPr>
+                <w:b w:val="0"/>
+                <w:sz w:val="18"/>
+              </w:rPr>
+              <w:t>Text classifier lead</w:t>
+            </w:r>
+          </w:p>
+        </w:tc>
+        <w:tc>
+          <w:tcPr>
+            <w:tcW w:type="dxa" w:w="1767"/>
+          </w:tcPr>
+          <w:p>
+            <w:r>
+              <w:rPr>
+                <w:b w:val="0"/>
+                <w:sz w:val="18"/>
+              </w:rPr>
+              <w:t>Text classification</w:t>
+            </w:r>
+          </w:p>
+        </w:tc>
+        <w:tc>
+          <w:tcPr>
+            <w:tcW w:type="dxa" w:w="3563"/>
+          </w:tcPr>
+          <w:p>
+            <w:r>
+              <w:rPr>
+                <w:b w:val="0"/>
+                <w:sz w:val="18"/>
+              </w:rPr>
+              <w:t>Own the training script and notebook, run Week 2 model improvements</w:t>
+            </w:r>
+          </w:p>
+        </w:tc>
+        <w:tc>
+          <w:tcPr>
+            <w:tcW w:type="dxa" w:w="1513"/>
+          </w:tcPr>
+          <w:p>
+            <w:r>
+              <w:rPr>
+                <w:b w:val="0"/>
+                <w:sz w:val="18"/>
+              </w:rPr>
+              <w:t>Henok Tesfahiwet Lbab Fidel</w:t>
+            </w:r>
+          </w:p>
+        </w:tc>
+      </w:tr>
+      <w:tr>
+        <w:tc>
+          <w:tcPr>
+            <w:tcW w:type="dxa" w:w="420"/>
+          </w:tcPr>
+          <w:p>
+            <w:r>
+              <w:rPr>
+                <w:b w:val="0"/>
+                <w:sz w:val="18"/>
+              </w:rPr>
+              <w:t>6</w:t>
+            </w:r>
+          </w:p>
+        </w:tc>
+        <w:tc>
+          <w:tcPr>
+            <w:tcW w:type="dxa" w:w="2148"/>
+          </w:tcPr>
+          <w:p>
+            <w:r>
+              <w:rPr>
+                <w:b w:val="0"/>
+                <w:sz w:val="18"/>
+              </w:rPr>
+              <w:t>Model evaluation and error analysis</w:t>
+            </w:r>
+          </w:p>
+        </w:tc>
+        <w:tc>
+          <w:tcPr>
+            <w:tcW w:type="dxa" w:w="1767"/>
+          </w:tcPr>
+          <w:p>
+            <w:r>
+              <w:rPr>
+                <w:b w:val="0"/>
+                <w:sz w:val="18"/>
+              </w:rPr>
+              <w:t>Text classification</w:t>
+            </w:r>
+          </w:p>
+        </w:tc>
+        <w:tc>
+          <w:tcPr>
+            <w:tcW w:type="dxa" w:w="3563"/>
+          </w:tcPr>
+          <w:p>
+            <w:r>
+              <w:rPr>
+                <w:b w:val="0"/>
+                <w:sz w:val="18"/>
+              </w:rPr>
+              <w:t>Own metrics, confusion matrix and failure analysis; tune the confidence threshold</w:t>
+            </w:r>
+          </w:p>
+        </w:tc>
+        <w:tc>
+          <w:tcPr>
+            <w:tcW w:type="dxa" w:w="1513"/>
+          </w:tcPr>
+          <w:p>
+            <w:r>
+              <w:rPr>
+                <w:b w:val="0"/>
+                <w:sz w:val="18"/>
+              </w:rPr>
+              <w:t>TUGUME ANDREW</w:t>
+            </w:r>
+          </w:p>
+        </w:tc>
+      </w:tr>
+      <w:tr>
+        <w:tc>
+          <w:tcPr>
+            <w:tcW w:type="dxa" w:w="420"/>
+          </w:tcPr>
+          <w:p>
+            <w:r>
+              <w:rPr>
+                <w:b w:val="0"/>
+                <w:sz w:val="18"/>
+              </w:rPr>
+              <w:t>7</w:t>
+            </w:r>
+          </w:p>
+        </w:tc>
+        <w:tc>
+          <w:tcPr>
+            <w:tcW w:type="dxa" w:w="2148"/>
+          </w:tcPr>
+          <w:p>
+            <w:r>
+              <w:rPr>
+                <w:b w:val="0"/>
+                <w:sz w:val="18"/>
+              </w:rPr>
+              <w:t>Legal decision support lead</w:t>
+            </w:r>
+          </w:p>
+        </w:tc>
+        <w:tc>
+          <w:tcPr>
+            <w:tcW w:type="dxa" w:w="1767"/>
+          </w:tcPr>
+          <w:p>
+            <w:r>
+              <w:rPr>
+                <w:b w:val="0"/>
+                <w:sz w:val="18"/>
+              </w:rPr>
+              <w:t>Decision support</w:t>
+            </w:r>
+          </w:p>
+        </w:tc>
+        <w:tc>
+          <w:tcPr>
+            <w:tcW w:type="dxa" w:w="3563"/>
+          </w:tcPr>
+          <w:p>
+            <w:r>
+              <w:rPr>
+                <w:b w:val="0"/>
+                <w:sz w:val="18"/>
+              </w:rPr>
+              <w:t>Design the structured workflow (issue, factors, next steps) and the escalation rules</w:t>
+            </w:r>
+          </w:p>
+        </w:tc>
+        <w:tc>
+          <w:tcPr>
+            <w:tcW w:type="dxa" w:w="1513"/>
+          </w:tcPr>
+          <w:p>
+            <w:r>
+              <w:rPr>
+                <w:b w:val="0"/>
+                <w:sz w:val="18"/>
+              </w:rPr>
+              <w:t>NAZIF SABO DANLADI</w:t>
+            </w:r>
+          </w:p>
+        </w:tc>
+      </w:tr>
+      <w:tr>
+        <w:tc>
+          <w:tcPr>
+            <w:tcW w:type="dxa" w:w="420"/>
+          </w:tcPr>
+          <w:p>
+            <w:r>
+              <w:rPr>
+                <w:b w:val="0"/>
+                <w:sz w:val="18"/>
+              </w:rPr>
+              <w:t>8</w:t>
+            </w:r>
+          </w:p>
+        </w:tc>
+        <w:tc>
+          <w:tcPr>
+            <w:tcW w:type="dxa" w:w="2148"/>
+          </w:tcPr>
+          <w:p>
+            <w:r>
+              <w:rPr>
+                <w:b w:val="0"/>
+                <w:sz w:val="18"/>
+              </w:rPr>
+              <w:t>Legal knowledge sources and retrieval</w:t>
+            </w:r>
+          </w:p>
+        </w:tc>
+        <w:tc>
+          <w:tcPr>
+            <w:tcW w:type="dxa" w:w="1767"/>
+          </w:tcPr>
+          <w:p>
+            <w:r>
+              <w:rPr>
+                <w:b w:val="0"/>
+                <w:sz w:val="18"/>
+              </w:rPr>
+              <w:t>Decision support</w:t>
+            </w:r>
+          </w:p>
+        </w:tc>
+        <w:tc>
+          <w:tcPr>
+            <w:tcW w:type="dxa" w:w="3563"/>
+          </w:tcPr>
+          <w:p>
+            <w:r>
+              <w:rPr>
+                <w:b w:val="0"/>
+                <w:sz w:val="18"/>
+              </w:rPr>
+              <w:t>Identify approved sources (e.g. ULII, pending approval), build and evaluate retrieval, keep sources traceable</w:t>
+            </w:r>
+          </w:p>
+        </w:tc>
+        <w:tc>
+          <w:tcPr>
+            <w:tcW w:type="dxa" w:w="1513"/>
+          </w:tcPr>
+          <w:p>
+            <w:r>
+              <w:rPr>
+                <w:b w:val="0"/>
+                <w:sz w:val="18"/>
+              </w:rPr>
+              <w:t>KAWUMA MICHAEL</w:t>
+            </w:r>
+          </w:p>
+        </w:tc>
+      </w:tr>
+      <w:tr>
+        <w:tc>
+          <w:tcPr>
+            <w:tcW w:type="dxa" w:w="420"/>
+          </w:tcPr>
+          <w:p>
+            <w:r>
+              <w:rPr>
+                <w:b w:val="0"/>
+                <w:sz w:val="18"/>
+              </w:rPr>
+              <w:t>9</w:t>
+            </w:r>
+          </w:p>
+        </w:tc>
+        <w:tc>
+          <w:tcPr>
+            <w:tcW w:type="dxa" w:w="2148"/>
+          </w:tcPr>
+          <w:p>
+            <w:r>
+              <w:rPr>
+                <w:b w:val="0"/>
+                <w:sz w:val="18"/>
+              </w:rPr>
+              <w:t>Recommendation system lead</w:t>
+            </w:r>
+          </w:p>
+        </w:tc>
+        <w:tc>
+          <w:tcPr>
+            <w:tcW w:type="dxa" w:w="1767"/>
+          </w:tcPr>
+          <w:p>
+            <w:r>
+              <w:rPr>
+                <w:b w:val="0"/>
+                <w:sz w:val="18"/>
+              </w:rPr>
+              <w:t>Recommendation</w:t>
+            </w:r>
+          </w:p>
+        </w:tc>
+        <w:tc>
+          <w:tcPr>
+            <w:tcW w:type="dxa" w:w="3563"/>
+          </w:tcPr>
+          <w:p>
+            <w:r>
+              <w:rPr>
+                <w:b w:val="0"/>
+                <w:sz w:val="18"/>
+              </w:rPr>
+              <w:t>Define what is recommended per category, build the rule-based recommender</w:t>
+            </w:r>
+          </w:p>
+        </w:tc>
+        <w:tc>
+          <w:tcPr>
+            <w:tcW w:type="dxa" w:w="1513"/>
+          </w:tcPr>
+          <w:p>
+            <w:r>
+              <w:rPr>
+                <w:b w:val="0"/>
+                <w:sz w:val="18"/>
+              </w:rPr>
+              <w:t>ATUHAIRE LYNNET</w:t>
+            </w:r>
+          </w:p>
+        </w:tc>
+      </w:tr>
+      <w:tr>
+        <w:tc>
+          <w:tcPr>
+            <w:tcW w:type="dxa" w:w="420"/>
+          </w:tcPr>
+          <w:p>
+            <w:r>
+              <w:rPr>
+                <w:b w:val="0"/>
+                <w:sz w:val="18"/>
+              </w:rPr>
+              <w:t>10</w:t>
+            </w:r>
+          </w:p>
+        </w:tc>
+        <w:tc>
+          <w:tcPr>
+            <w:tcW w:type="dxa" w:w="2148"/>
+          </w:tcPr>
+          <w:p>
+            <w:r>
+              <w:rPr>
+                <w:b w:val="0"/>
+                <w:sz w:val="18"/>
+              </w:rPr>
+              <w:t>Recommendation relevance testing</w:t>
+            </w:r>
+          </w:p>
+        </w:tc>
+        <w:tc>
+          <w:tcPr>
+            <w:tcW w:type="dxa" w:w="1767"/>
+          </w:tcPr>
+          <w:p>
+            <w:r>
+              <w:rPr>
+                <w:b w:val="0"/>
+                <w:sz w:val="18"/>
+              </w:rPr>
+              <w:t>Recommendation</w:t>
+            </w:r>
+          </w:p>
+        </w:tc>
+        <w:tc>
+          <w:tcPr>
+            <w:tcW w:type="dxa" w:w="3563"/>
+          </w:tcPr>
+          <w:p>
+            <w:r>
+              <w:rPr>
+                <w:b w:val="0"/>
+                <w:sz w:val="18"/>
+              </w:rPr>
+              <w:t>Write test scenarios and rate the relevance of recommendations</w:t>
+            </w:r>
+          </w:p>
+        </w:tc>
+        <w:tc>
+          <w:tcPr>
+            <w:tcW w:type="dxa" w:w="1513"/>
+          </w:tcPr>
+          <w:p>
+            <w:r>
+              <w:rPr>
+                <w:b w:val="0"/>
+                <w:sz w:val="18"/>
+              </w:rPr>
+              <w:t>NAMUSANA REBECCA</w:t>
+            </w:r>
+          </w:p>
+        </w:tc>
+      </w:tr>
+      <w:tr>
+        <w:tc>
+          <w:tcPr>
+            <w:tcW w:type="dxa" w:w="420"/>
+          </w:tcPr>
+          <w:p>
+            <w:r>
+              <w:rPr>
+                <w:b w:val="0"/>
+                <w:sz w:val="18"/>
+              </w:rPr>
+              <w:t>11</w:t>
+            </w:r>
+          </w:p>
+        </w:tc>
+        <w:tc>
+          <w:tcPr>
+            <w:tcW w:type="dxa" w:w="2148"/>
+          </w:tcPr>
+          <w:p>
+            <w:r>
+              <w:rPr>
+                <w:b w:val="0"/>
+                <w:sz w:val="18"/>
+              </w:rPr>
+              <w:t>Chatbot lead</w:t>
+            </w:r>
+          </w:p>
+        </w:tc>
+        <w:tc>
+          <w:tcPr>
+            <w:tcW w:type="dxa" w:w="1767"/>
+          </w:tcPr>
+          <w:p>
+            <w:r>
+              <w:rPr>
+                <w:b w:val="0"/>
+                <w:sz w:val="18"/>
+              </w:rPr>
+              <w:t>Chatbot</w:t>
+            </w:r>
+          </w:p>
+        </w:tc>
+        <w:tc>
+          <w:tcPr>
+            <w:tcW w:type="dxa" w:w="3563"/>
+          </w:tcPr>
+          <w:p>
+            <w:r>
+              <w:rPr>
+                <w:b w:val="0"/>
+                <w:sz w:val="18"/>
+              </w:rPr>
+              <w:t>Build the conversation flow that presents the outputs of the other components</w:t>
+            </w:r>
+          </w:p>
+        </w:tc>
+        <w:tc>
+          <w:tcPr>
+            <w:tcW w:type="dxa" w:w="1513"/>
+          </w:tcPr>
+          <w:p>
+            <w:r>
+              <w:rPr>
+                <w:b w:val="0"/>
+                <w:sz w:val="18"/>
+              </w:rPr>
+              <w:t>NASSEJJE RACHEAL</w:t>
+            </w:r>
+          </w:p>
+        </w:tc>
+      </w:tr>
+      <w:tr>
+        <w:tc>
+          <w:tcPr>
+            <w:tcW w:type="dxa" w:w="420"/>
+          </w:tcPr>
+          <w:p>
+            <w:r>
+              <w:rPr>
+                <w:b w:val="0"/>
+                <w:sz w:val="18"/>
+              </w:rPr>
+              <w:t>12</w:t>
+            </w:r>
+          </w:p>
+        </w:tc>
+        <w:tc>
+          <w:tcPr>
+            <w:tcW w:type="dxa" w:w="2148"/>
+          </w:tcPr>
+          <w:p>
+            <w:r>
+              <w:rPr>
+                <w:b w:val="0"/>
+                <w:sz w:val="18"/>
+              </w:rPr>
+              <w:t>Integration and API</w:t>
+            </w:r>
+          </w:p>
+        </w:tc>
+        <w:tc>
+          <w:tcPr>
+            <w:tcW w:type="dxa" w:w="1767"/>
+          </w:tcPr>
+          <w:p>
+            <w:r>
+              <w:rPr>
+                <w:b w:val="0"/>
+                <w:sz w:val="18"/>
+              </w:rPr>
+              <w:t>Chatbot / all</w:t>
+            </w:r>
+          </w:p>
+        </w:tc>
+        <w:tc>
+          <w:tcPr>
+            <w:tcW w:type="dxa" w:w="3563"/>
+          </w:tcPr>
+          <w:p>
+            <w:r>
+              <w:rPr>
+                <w:b w:val="0"/>
+                <w:sz w:val="18"/>
+              </w:rPr>
+              <w:t xml:space="preserve">Wrap </w:t>
+            </w:r>
+            <w:r>
+              <w:rPr>
+                <w:rFonts w:ascii="Consolas" w:hAnsi="Consolas"/>
+                <w:b w:val="0"/>
+                <w:sz w:val="18"/>
+              </w:rPr>
+              <w:t>predict()</w:t>
+            </w:r>
+            <w:r>
+              <w:rPr>
+                <w:b w:val="0"/>
+                <w:sz w:val="18"/>
+              </w:rPr>
+              <w:t xml:space="preserve"> and the other components in one API (FastAPI or Flask), connect them end to end</w:t>
+            </w:r>
+          </w:p>
+        </w:tc>
+        <w:tc>
+          <w:tcPr>
+            <w:tcW w:type="dxa" w:w="1513"/>
+          </w:tcPr>
+          <w:p>
+            <w:r>
+              <w:rPr>
+                <w:b w:val="0"/>
+                <w:sz w:val="18"/>
+              </w:rPr>
+              <w:t>Mustapha suleiman Ali</w:t>
+            </w:r>
+          </w:p>
+        </w:tc>
+      </w:tr>
+      <w:tr>
+        <w:tc>
+          <w:tcPr>
+            <w:tcW w:type="dxa" w:w="420"/>
+          </w:tcPr>
+          <w:p>
+            <w:r>
+              <w:rPr>
+                <w:b w:val="0"/>
+                <w:sz w:val="18"/>
+              </w:rPr>
+              <w:t>13</w:t>
+            </w:r>
+          </w:p>
+        </w:tc>
+        <w:tc>
+          <w:tcPr>
+            <w:tcW w:type="dxa" w:w="2148"/>
+          </w:tcPr>
+          <w:p>
+            <w:r>
+              <w:rPr>
+                <w:b w:val="0"/>
+                <w:sz w:val="18"/>
+              </w:rPr>
+              <w:t>Safety, testing and quality assurance</w:t>
+            </w:r>
+          </w:p>
+        </w:tc>
+        <w:tc>
+          <w:tcPr>
+            <w:tcW w:type="dxa" w:w="1767"/>
+          </w:tcPr>
+          <w:p>
+            <w:r>
+              <w:rPr>
+                <w:b w:val="0"/>
+                <w:sz w:val="18"/>
+              </w:rPr>
+              <w:t>All</w:t>
+            </w:r>
+          </w:p>
+        </w:tc>
+        <w:tc>
+          <w:tcPr>
+            <w:tcW w:type="dxa" w:w="3563"/>
+          </w:tcPr>
+          <w:p>
+            <w:r>
+              <w:rPr>
+                <w:b w:val="0"/>
+                <w:sz w:val="18"/>
+              </w:rPr>
+              <w:t>Disclaimers, refusal/clarification/referral cases, end-to-end test scenarios, final demo checklist</w:t>
+            </w:r>
+          </w:p>
+        </w:tc>
+        <w:tc>
+          <w:tcPr>
+            <w:tcW w:type="dxa" w:w="1513"/>
+          </w:tcPr>
+          <w:p>
+            <w:r>
+              <w:rPr>
+                <w:b w:val="0"/>
+                <w:sz w:val="18"/>
+              </w:rPr>
+              <w:t>TWIJUKYE DISMAS</w:t>
+            </w:r>
+          </w:p>
+        </w:tc>
+      </w:tr>
+    </w:tbl>
+    <w:p/>
     <w:p>
       <w:pPr>
         <w:pStyle w:val="Heading2"/>
@@ -11859,6 +13053,114 @@
                 <w:sz w:val="17"/>
               </w:rPr>
               <w:t>docs: complete README with run, reproduce and structure instructions</w:t>
+            </w:r>
+          </w:p>
+        </w:tc>
+      </w:tr>
+      <w:tr>
+        <w:tc>
+          <w:tcPr>
+            <w:tcW w:type="dxa" w:w="1481"/>
+          </w:tcPr>
+          <w:p>
+            <w:r>
+              <w:rPr>
+                <w:sz w:val="17"/>
+              </w:rPr>
+              <w:t>4528625</w:t>
+            </w:r>
+          </w:p>
+        </w:tc>
+        <w:tc>
+          <w:tcPr>
+            <w:tcW w:type="dxa" w:w="1990"/>
+          </w:tcPr>
+          <w:p>
+            <w:r>
+              <w:rPr>
+                <w:sz w:val="17"/>
+              </w:rPr>
+              <w:t>2026-10-20</w:t>
+            </w:r>
+          </w:p>
+        </w:tc>
+        <w:tc>
+          <w:tcPr>
+            <w:tcW w:type="dxa" w:w="2329"/>
+          </w:tcPr>
+          <w:p>
+            <w:r>
+              <w:rPr>
+                <w:sz w:val="17"/>
+              </w:rPr>
+              <w:t>sm172620-bit</w:t>
+            </w:r>
+          </w:p>
+        </w:tc>
+        <w:tc>
+          <w:tcPr>
+            <w:tcW w:type="dxa" w:w="3611"/>
+          </w:tcPr>
+          <w:p>
+            <w:r>
+              <w:rPr>
+                <w:sz w:val="17"/>
+              </w:rPr>
+              <w:t>report: generate Word submission report</w:t>
+            </w:r>
+          </w:p>
+        </w:tc>
+      </w:tr>
+      <w:tr>
+        <w:tc>
+          <w:tcPr>
+            <w:tcW w:type="dxa" w:w="1481"/>
+          </w:tcPr>
+          <w:p>
+            <w:r>
+              <w:rPr>
+                <w:sz w:val="17"/>
+              </w:rPr>
+              <w:t>7d31ca0</w:t>
+            </w:r>
+          </w:p>
+        </w:tc>
+        <w:tc>
+          <w:tcPr>
+            <w:tcW w:type="dxa" w:w="1990"/>
+          </w:tcPr>
+          <w:p>
+            <w:r>
+              <w:rPr>
+                <w:sz w:val="17"/>
+              </w:rPr>
+              <w:t>2026-10-20</w:t>
+            </w:r>
+          </w:p>
+        </w:tc>
+        <w:tc>
+          <w:tcPr>
+            <w:tcW w:type="dxa" w:w="2329"/>
+          </w:tcPr>
+          <w:p>
+            <w:r>
+              <w:rPr>
+                <w:sz w:val="17"/>
+              </w:rPr>
+              <w:t>sm172620-bit</w:t>
+            </w:r>
+          </w:p>
+        </w:tc>
+        <w:tc>
+          <w:tcPr>
+            <w:tcW w:type="dxa" w:w="3611"/>
+          </w:tcPr>
+          <w:p>
+            <w:r>
+              <w:rPr>
+                <w:sz w:val="17"/>
+              </w:rPr>
+              <w:t>docs: add proposed random role allocation for group members</w:t>
             </w:r>
           </w:p>
         </w:tc>

</xml_diff>

<commit_message>
report: rebuild Word report with agreed roles
Co-Authored-By: Claude Opus 5.5 <noreply@anthropic.com>
</commit_message>
<xml_diff>
--- a/report/Kimuntu_AI_Week1_Report.docx
+++ b/report/Kimuntu_AI_Week1_Report.docx
@@ -10275,19 +10275,19 @@
         <w:rPr>
           <w:b w:val="0"/>
         </w:rPr>
-        <w:t xml:space="preserve">Roles are a </w:t>
+        <w:t xml:space="preserve">Roles were assigned at random and </w:t>
       </w:r>
       <w:r>
         <w:rPr>
           <w:b/>
         </w:rPr>
-        <w:t>proposal, assigned at random</w:t>
+        <w:t>agreed by the group</w:t>
       </w:r>
       <w:r>
         <w:rPr>
           <w:b w:val="0"/>
         </w:rPr>
-        <w:t xml:space="preserve">, for members to confirm or swap. See </w:t>
+        <w:t xml:space="preserve">. See </w:t>
       </w:r>
       <w:r>
         <w:rPr>
@@ -10352,7 +10352,7 @@
                 <w:b/>
                 <w:sz w:val="18"/>
               </w:rPr>
-              <w:t>Proposed role (to be confirmed)</w:t>
+              <w:t>Agreed role</w:t>
             </w:r>
           </w:p>
         </w:tc>
@@ -10994,7 +10994,7 @@
         <w:pStyle w:val="Heading2"/>
       </w:pPr>
       <w:r>
-        <w:t>Proposed team role allocation</w:t>
+        <w:t>Team role allocation</w:t>
       </w:r>
     </w:p>
     <w:p>
@@ -11005,13 +11005,13 @@
         <w:rPr>
           <w:b/>
         </w:rPr>
-        <w:t>Status: PROPOSAL.</w:t>
+        <w:t>Status: AGREED by the group.</w:t>
       </w:r>
       <w:r>
         <w:rPr>
           <w:b w:val="0"/>
         </w:rPr>
-        <w:t xml:space="preserve"> These roles were assigned </w:t>
+        <w:t xml:space="preserve"> The roles were assigned </w:t>
       </w:r>
       <w:r>
         <w:rPr>
@@ -11023,7 +11023,7 @@
         <w:rPr>
           <w:b w:val="0"/>
         </w:rPr>
-        <w:t xml:space="preserve"> so the group has a starting point. They describe </w:t>
+        <w:t xml:space="preserve"> and accepted as they are. They describe </w:t>
       </w:r>
       <w:r>
         <w:rPr>
@@ -11035,7 +11035,7 @@
         <w:rPr>
           <w:b w:val="0"/>
         </w:rPr>
-        <w:t xml:space="preserve"> responsibilities for the 4-week project, not work already done. Each member should confirm, swap or change their role in a group meeting. Each member must still write their </w:t>
+        <w:t xml:space="preserve"> responsibilities for the 4-week project, not work already done. Each member must still write their </w:t>
       </w:r>
       <w:r>
         <w:rPr>
@@ -11137,7 +11137,7 @@
                 <w:b/>
                 <w:sz w:val="18"/>
               </w:rPr>
-              <w:t>Proposed role</w:t>
+              <w:t>Role</w:t>
             </w:r>
           </w:p>
         </w:tc>
@@ -13161,6 +13161,114 @@
                 <w:sz w:val="17"/>
               </w:rPr>
               <w:t>docs: add proposed random role allocation for group members</w:t>
+            </w:r>
+          </w:p>
+        </w:tc>
+      </w:tr>
+      <w:tr>
+        <w:tc>
+          <w:tcPr>
+            <w:tcW w:type="dxa" w:w="1481"/>
+          </w:tcPr>
+          <w:p>
+            <w:r>
+              <w:rPr>
+                <w:sz w:val="17"/>
+              </w:rPr>
+              <w:t>2cdad1a</w:t>
+            </w:r>
+          </w:p>
+        </w:tc>
+        <w:tc>
+          <w:tcPr>
+            <w:tcW w:type="dxa" w:w="1990"/>
+          </w:tcPr>
+          <w:p>
+            <w:r>
+              <w:rPr>
+                <w:sz w:val="17"/>
+              </w:rPr>
+              <w:t>2026-10-20</w:t>
+            </w:r>
+          </w:p>
+        </w:tc>
+        <w:tc>
+          <w:tcPr>
+            <w:tcW w:type="dxa" w:w="2329"/>
+          </w:tcPr>
+          <w:p>
+            <w:r>
+              <w:rPr>
+                <w:sz w:val="17"/>
+              </w:rPr>
+              <w:t>sm172620-bit</w:t>
+            </w:r>
+          </w:p>
+        </w:tc>
+        <w:tc>
+          <w:tcPr>
+            <w:tcW w:type="dxa" w:w="3611"/>
+          </w:tcPr>
+          <w:p>
+            <w:r>
+              <w:rPr>
+                <w:sz w:val="17"/>
+              </w:rPr>
+              <w:t>report: rebuild Word report with proposed role allocation</w:t>
+            </w:r>
+          </w:p>
+        </w:tc>
+      </w:tr>
+      <w:tr>
+        <w:tc>
+          <w:tcPr>
+            <w:tcW w:type="dxa" w:w="1481"/>
+          </w:tcPr>
+          <w:p>
+            <w:r>
+              <w:rPr>
+                <w:sz w:val="17"/>
+              </w:rPr>
+              <w:t>72d8f1a</w:t>
+            </w:r>
+          </w:p>
+        </w:tc>
+        <w:tc>
+          <w:tcPr>
+            <w:tcW w:type="dxa" w:w="1990"/>
+          </w:tcPr>
+          <w:p>
+            <w:r>
+              <w:rPr>
+                <w:sz w:val="17"/>
+              </w:rPr>
+              <w:t>2026-10-20</w:t>
+            </w:r>
+          </w:p>
+        </w:tc>
+        <w:tc>
+          <w:tcPr>
+            <w:tcW w:type="dxa" w:w="2329"/>
+          </w:tcPr>
+          <w:p>
+            <w:r>
+              <w:rPr>
+                <w:sz w:val="17"/>
+              </w:rPr>
+              <w:t>sm172620-bit</w:t>
+            </w:r>
+          </w:p>
+        </w:tc>
+        <w:tc>
+          <w:tcPr>
+            <w:tcW w:type="dxa" w:w="3611"/>
+          </w:tcPr>
+          <w:p>
+            <w:r>
+              <w:rPr>
+                <w:sz w:val="17"/>
+              </w:rPr>
+              <w:t>docs: mark group role allocation as agreed</w:t>
             </w:r>
           </w:p>
         </w:tc>

</xml_diff>